<commit_message>
Consolidate dropbox-sign-service into repo root for Railway deployment
Railway was deploying from repo root, running the old reportlab-based
main.py instead of the template-based version in dropbox-sign-service/.
This moves all service files to root and removes the subdirectory.

Co-Authored-By: Claude Opus 4.6 <noreply@anthropic.com>
</commit_message>
<xml_diff>
--- a/templates/3day_commercial_TEMPLATE.docx
+++ b/templates/3day_commercial_TEMPLATE.docx
@@ -830,13 +830,7 @@
         <w:rPr>
           <w:sz w:val="24"/>
         </w:rPr>
-        <w:t xml:space="preserve">{{RENT_DUE_DATE}}</w:t>
-      </w:r>
-      <w:r>
-        <w:rPr>
-          <w:sz w:val="24"/>
-        </w:rPr>
-        <w:t xml:space="preserve">     {{AMOUNT_DUE}}</w:t>
+        <w:t>{{RENT_DUE_DATE}}</w:t>
       </w:r>
     </w:p>
     <w:p>
@@ -871,6 +865,22 @@
           <w:u w:val="single" w:color="0B0B0B"/>
         </w:rPr>
         <w:t>DUE</w:t>
+      </w:r>
+    </w:p>
+    <w:p>
+      <w:pPr>
+        <w:spacing w:before="46"/>
+        <w:ind w:left="1169" w:right="0" w:firstLine="0"/>
+        <w:jc w:val="left"/>
+        <w:rPr>
+          <w:sz w:val="24"/>
+        </w:rPr>
+      </w:pPr>
+      <w:r>
+        <w:rPr>
+          <w:sz w:val="24"/>
+        </w:rPr>
+        <w:t>{{AMOUNT_DUE}}</w:t>
       </w:r>
     </w:p>
     <w:p>

</xml_diff>